<commit_message>
Correção no numero das paginas
</commit_message>
<xml_diff>
--- a/Documentação/MaintSys_Documentacao_v2.docx
+++ b/Documentação/MaintSys_Documentacao_v2.docx
@@ -417,6 +417,7 @@
     <w:p>
       <w:pPr>
         <w:sectPr>
+          <w:headerReference w:type="default" r:id="rId16"/>
           <w:pgSz w:w="12240" w:h="15840"/>
           <w:pgMar w:top="1440" w:right="1440" w:bottom="1440" w:left="1440" w:header="708" w:footer="708" w:gutter="0"/>
           <w:cols w:space="720"/>
@@ -1088,9 +1089,15 @@
       </w:sdtContent>
     </w:sdt>
     <w:p>
-      <w:r>
-        <w:br w:type="page"/>
-      </w:r>
+      <w:pPr>
+        <w:sectPr>
+          <w:headerReference w:type="default" r:id="rId16"/>
+          <w:pgSz w:w="12240" w:h="15840"/>
+          <w:pgMar w:top="1440" w:right="1440" w:bottom="1440" w:left="1440" w:header="708" w:footer="708" w:gutter="0"/>
+          <w:cols w:space="720"/>
+          <w:docGrid w:linePitch="360"/>
+        </w:sectPr>
+      </w:pPr>
     </w:p>
     <w:p>
       <w:pPr>
@@ -6012,7 +6019,7 @@
         <w:sz w:val="18"/>
         <w:szCs w:val="18"/>
       </w:rPr>
-      <w:t>2</w:t>
+      <w:t>1</w:t>
     </w:r>
     <w:r>
       <w:rPr>
@@ -6022,6 +6029,16 @@
       </w:rPr>
       <w:fldChar w:fldCharType="end"/>
     </w:r>
+  </w:p>
+</w:hdr>
+</file>
+
+<file path=word/header2.xml><?xml version="1.0" encoding="utf-8"?>
+<w:hdr xmlns:w="http://schemas.openxmlformats.org/wordprocessingml/2006/main">
+  <w:p>
+    <w:pPr>
+      <w:jc w:val="right"/>
+    </w:pPr>
   </w:p>
 </w:hdr>
 </file>

</xml_diff>